<commit_message>
docs(cv): polish ATS docx (1.25cm margins, edu/cert 9pt, blue links, GitHub, 'Master in')
Co-Authored-By: Claude Opus 4.8 <noreply@anthropic.com>
</commit_message>
<xml_diff>
--- a/docs/cv/cv-jonathan-schummers-ats.docx
+++ b/docs/cv/cv-jonathan-schummers-ats.docx
@@ -28,11 +28,11 @@
         </w:rPr>
         <w:t xml:space="preserve">	</w:t>
       </w:r>
-      <w:hyperlink w:history="1" r:id="rIdjoqpx4wm3wn4cknteypbt">
+      <w:hyperlink w:history="1" r:id="rIdd7pnmazyupwnsukm5srjw">
         <w:r>
           <w:rPr>
             <w:rFonts w:ascii="Manrope" w:cs="Manrope" w:eastAsia="Manrope" w:hAnsi="Manrope"/>
-            <w:color w:val="18181B"/>
+            <w:color w:val="1155CC"/>
             <w:sz w:val="18"/>
             <w:szCs w:val="18"/>
             <w:u w:val="single"/>
@@ -48,11 +48,11 @@
         </w:rPr>
         <w:t xml:space="preserve">      </w:t>
       </w:r>
-      <w:hyperlink w:history="1" r:id="rId8vlpa6dsdmvyw4vjpgf8c">
+      <w:hyperlink w:history="1" r:id="rIdrh96tbxkaontskanctcrz">
         <w:r>
           <w:rPr>
             <w:rFonts w:ascii="Manrope" w:cs="Manrope" w:eastAsia="Manrope" w:hAnsi="Manrope"/>
-            <w:color w:val="18181B"/>
+            <w:color w:val="1155CC"/>
             <w:sz w:val="18"/>
             <w:szCs w:val="18"/>
             <w:u w:val="single"/>
@@ -832,8 +832,8 @@
         <w:rPr>
           <w:rFonts w:ascii="Manrope" w:cs="Manrope" w:eastAsia="Manrope" w:hAnsi="Manrope"/>
           <w:color w:val="66666F"/>
-          <w:sz w:val="19"/>
-          <w:szCs w:val="19"/>
+          <w:sz w:val="18"/>
+          <w:szCs w:val="18"/>
         </w:rPr>
         <w:t xml:space="preserve"> · Université Paris Cité</w:t>
       </w:r>
@@ -872,17 +872,18 @@
       <w:r>
         <w:rPr>
           <w:rFonts w:ascii="Manrope SemiBold" w:cs="Manrope SemiBold" w:eastAsia="Manrope SemiBold" w:hAnsi="Manrope SemiBold"/>
-          <w:sz w:val="19"/>
-          <w:szCs w:val="19"/>
-        </w:rPr>
-        <w:t xml:space="preserve">Master, Human-Machine Interactions</w:t>
-      </w:r>
-      <w:r>
-        <w:rPr>
-          <w:rFonts w:ascii="Manrope" w:cs="Manrope" w:eastAsia="Manrope" w:hAnsi="Manrope"/>
-          <w:color w:val="9F9FA7"/>
-          <w:sz w:val="19"/>
-          <w:szCs w:val="19"/>
+          <w:color w:val="18181B"/>
+          <w:sz w:val="18"/>
+          <w:szCs w:val="18"/>
+        </w:rPr>
+        <w:t xml:space="preserve">Master in Human-Machine Interactions</w:t>
+      </w:r>
+      <w:r>
+        <w:rPr>
+          <w:rFonts w:ascii="Manrope" w:cs="Manrope" w:eastAsia="Manrope" w:hAnsi="Manrope"/>
+          <w:color w:val="9F9FA7"/>
+          <w:sz w:val="18"/>
+          <w:szCs w:val="18"/>
         </w:rPr>
         <w:t xml:space="preserve"> · </w:t>
       </w:r>
@@ -890,8 +891,8 @@
         <w:rPr>
           <w:rFonts w:ascii="Manrope" w:cs="Manrope" w:eastAsia="Manrope" w:hAnsi="Manrope"/>
           <w:color w:val="66666F"/>
-          <w:sz w:val="19"/>
-          <w:szCs w:val="19"/>
+          <w:sz w:val="18"/>
+          <w:szCs w:val="18"/>
         </w:rPr>
         <w:t xml:space="preserve">Université Lumière Lyon 2</w:t>
       </w:r>
@@ -915,17 +916,18 @@
       <w:r>
         <w:rPr>
           <w:rFonts w:ascii="Manrope SemiBold" w:cs="Manrope SemiBold" w:eastAsia="Manrope SemiBold" w:hAnsi="Manrope SemiBold"/>
-          <w:sz w:val="19"/>
-          <w:szCs w:val="19"/>
-        </w:rPr>
-        <w:t xml:space="preserve">Master, Cognitive Psychology</w:t>
-      </w:r>
-      <w:r>
-        <w:rPr>
-          <w:rFonts w:ascii="Manrope" w:cs="Manrope" w:eastAsia="Manrope" w:hAnsi="Manrope"/>
-          <w:color w:val="9F9FA7"/>
-          <w:sz w:val="19"/>
-          <w:szCs w:val="19"/>
+          <w:color w:val="18181B"/>
+          <w:sz w:val="18"/>
+          <w:szCs w:val="18"/>
+        </w:rPr>
+        <w:t xml:space="preserve">Master in Cognitive Psychology</w:t>
+      </w:r>
+      <w:r>
+        <w:rPr>
+          <w:rFonts w:ascii="Manrope" w:cs="Manrope" w:eastAsia="Manrope" w:hAnsi="Manrope"/>
+          <w:color w:val="9F9FA7"/>
+          <w:sz w:val="18"/>
+          <w:szCs w:val="18"/>
         </w:rPr>
         <w:t xml:space="preserve"> · </w:t>
       </w:r>
@@ -933,8 +935,8 @@
         <w:rPr>
           <w:rFonts w:ascii="Manrope" w:cs="Manrope" w:eastAsia="Manrope" w:hAnsi="Manrope"/>
           <w:color w:val="66666F"/>
-          <w:sz w:val="19"/>
-          <w:szCs w:val="19"/>
+          <w:sz w:val="18"/>
+          <w:szCs w:val="18"/>
         </w:rPr>
         <w:t xml:space="preserve">Université Paris Descartes</w:t>
       </w:r>
@@ -958,8 +960,9 @@
       <w:r>
         <w:rPr>
           <w:rFonts w:ascii="Manrope SemiBold" w:cs="Manrope SemiBold" w:eastAsia="Manrope SemiBold" w:hAnsi="Manrope SemiBold"/>
-          <w:sz w:val="19"/>
-          <w:szCs w:val="19"/>
+          <w:color w:val="18181B"/>
+          <w:sz w:val="18"/>
+          <w:szCs w:val="18"/>
         </w:rPr>
         <w:t xml:space="preserve">Licensed Real Estate Professional</w:t>
       </w:r>
@@ -967,8 +970,8 @@
         <w:rPr>
           <w:rFonts w:ascii="Manrope" w:cs="Manrope" w:eastAsia="Manrope" w:hAnsi="Manrope"/>
           <w:color w:val="9F9FA7"/>
-          <w:sz w:val="19"/>
-          <w:szCs w:val="19"/>
+          <w:sz w:val="18"/>
+          <w:szCs w:val="18"/>
         </w:rPr>
         <w:t xml:space="preserve"> · </w:t>
       </w:r>
@@ -976,8 +979,8 @@
         <w:rPr>
           <w:rFonts w:ascii="Manrope" w:cs="Manrope" w:eastAsia="Manrope" w:hAnsi="Manrope"/>
           <w:color w:val="66666F"/>
-          <w:sz w:val="19"/>
-          <w:szCs w:val="19"/>
+          <w:sz w:val="18"/>
+          <w:szCs w:val="18"/>
         </w:rPr>
         <w:t xml:space="preserve">Luxembourg Chamber of Commerce</w:t>
       </w:r>
@@ -1001,8 +1004,9 @@
       <w:r>
         <w:rPr>
           <w:rFonts w:ascii="Manrope SemiBold" w:cs="Manrope SemiBold" w:eastAsia="Manrope SemiBold" w:hAnsi="Manrope SemiBold"/>
-          <w:sz w:val="19"/>
-          <w:szCs w:val="19"/>
+          <w:color w:val="18181B"/>
+          <w:sz w:val="18"/>
+          <w:szCs w:val="18"/>
         </w:rPr>
         <w:t xml:space="preserve">PSPO &amp; PSU</w:t>
       </w:r>
@@ -1010,8 +1014,8 @@
         <w:rPr>
           <w:rFonts w:ascii="Manrope" w:cs="Manrope" w:eastAsia="Manrope" w:hAnsi="Manrope"/>
           <w:color w:val="9F9FA7"/>
-          <w:sz w:val="19"/>
-          <w:szCs w:val="19"/>
+          <w:sz w:val="18"/>
+          <w:szCs w:val="18"/>
         </w:rPr>
         <w:t xml:space="preserve"> · </w:t>
       </w:r>
@@ -1019,8 +1023,8 @@
         <w:rPr>
           <w:rFonts w:ascii="Manrope" w:cs="Manrope" w:eastAsia="Manrope" w:hAnsi="Manrope"/>
           <w:color w:val="66666F"/>
-          <w:sz w:val="19"/>
-          <w:szCs w:val="19"/>
+          <w:sz w:val="18"/>
+          <w:szCs w:val="18"/>
         </w:rPr>
         <w:t xml:space="preserve">Professional Scrum Product Owner I · Professional Scrum with UX (Scrum.org)</w:t>
       </w:r>
@@ -1123,7 +1127,7 @@
           <w:sz w:val="19"/>
           <w:szCs w:val="19"/>
         </w:rPr>
-        <w:t xml:space="preserve">Figma · Miro · Hotjar · PostHog · Jira · Linear · Notion · Cursor · Claude Code</w:t>
+        <w:t xml:space="preserve">Figma · Miro · Hotjar · PostHog · Jira · Linear · Notion · GitHub · Cursor · Claude Code</w:t>
       </w:r>
     </w:p>
     <w:sectPr>

</xml_diff>

<commit_message>
docs(cv): use 'Master of' for degree titles
Co-Authored-By: Claude Opus 4.8 <noreply@anthropic.com>
</commit_message>
<xml_diff>
--- a/docs/cv/cv-jonathan-schummers-ats.docx
+++ b/docs/cv/cv-jonathan-schummers-ats.docx
@@ -28,7 +28,7 @@
         </w:rPr>
         <w:t xml:space="preserve">	</w:t>
       </w:r>
-      <w:hyperlink w:history="1" r:id="rIdd7pnmazyupwnsukm5srjw">
+      <w:hyperlink w:history="1" r:id="rIdu2nyhhd3tren1fk8yw3or">
         <w:r>
           <w:rPr>
             <w:rFonts w:ascii="Manrope" w:cs="Manrope" w:eastAsia="Manrope" w:hAnsi="Manrope"/>
@@ -48,7 +48,7 @@
         </w:rPr>
         <w:t xml:space="preserve">      </w:t>
       </w:r>
-      <w:hyperlink w:history="1" r:id="rIdrh96tbxkaontskanctcrz">
+      <w:hyperlink w:history="1" r:id="rIdbiwwbg9mxitzcbnyjjnw6">
         <w:r>
           <w:rPr>
             <w:rFonts w:ascii="Manrope" w:cs="Manrope" w:eastAsia="Manrope" w:hAnsi="Manrope"/>
@@ -876,7 +876,7 @@
           <w:sz w:val="18"/>
           <w:szCs w:val="18"/>
         </w:rPr>
-        <w:t xml:space="preserve">Master in Human-Machine Interactions</w:t>
+        <w:t xml:space="preserve">Master of Human-Machine Interactions</w:t>
       </w:r>
       <w:r>
         <w:rPr>
@@ -920,7 +920,7 @@
           <w:sz w:val="18"/>
           <w:szCs w:val="18"/>
         </w:rPr>
-        <w:t xml:space="preserve">Master in Cognitive Psychology</w:t>
+        <w:t xml:space="preserve">Master of Cognitive Psychology</w:t>
       </w:r>
       <w:r>
         <w:rPr>

</xml_diff>